<commit_message>
feat: adiciona chave PIX em todos os contratos e formulários
- Templates gestor, lider e vendedor agora incluem {chave_pix} na cláusula de pagamento
- Campo Chave PIX adicionado ao formulário para todos os tipos de contrato
- Validação obrigatória da chave PIX no servidor
- Corrige encoding de caracteres especiais no nome do arquivo gerado
- Adiciona Cache-Control no-store para evitar cache do HTML

Co-Authored-By: Claude Sonnet 4.6 <noreply@anthropic.com>
</commit_message>
<xml_diff>
--- a/templates/processed/gestor.docx
+++ b/templates/processed/gestor.docx
@@ -102,96 +102,97 @@
           <w:bCs w:val="1"/>
           <w:rtl w:val="0"/>
         </w:rPr>
-        <w:t xml:space="preserve">CONTRATADO: {razao_social}, pessoa jurídica inscrita no CNPJ nº {cnpj}, com endereço à Rua {endereco} CEP: {cep}, neste ato representado por seu sócio administrador, Sr. {representante}, inscrito no CPF sob o nº {cpf}, telefone {telefone}, endereço eletrônico {email} .</w:t>
-      </w:r>
-      <w:r>
-        <w:rPr>
-          <w:rFonts w:ascii="Book Antiqua" w:cs="Book Antiqua" w:eastAsia="Book Antiqua" w:hAnsi="Book Antiqua"/>
-          <w:rtl w:val="0"/>
-        </w:rPr>
-        <w:t xml:space="preserve"/>
-      </w:r>
-      <w:r>
-        <w:rPr>
-          <w:rFonts w:ascii="Book Antiqua" w:cs="Book Antiqua" w:eastAsia="Book Antiqua" w:hAnsi="Book Antiqua"/>
-          <w:b w:val="1"/>
-          <w:bCs w:val="1"/>
-          <w:highlight w:val="yellow"/>
-          <w:rtl w:val="0"/>
-        </w:rPr>
-        <w:t xml:space="preserve"/>
-      </w:r>
-      <w:r>
-        <w:rPr>
-          <w:rFonts w:ascii="Book Antiqua" w:cs="Book Antiqua" w:eastAsia="Book Antiqua" w:hAnsi="Book Antiqua"/>
-          <w:rtl w:val="0"/>
-        </w:rPr>
-        <w:t xml:space="preserve"/>
-      </w:r>
-      <w:r>
-        <w:rPr>
-          <w:rFonts w:ascii="Book Antiqua" w:cs="Book Antiqua" w:eastAsia="Book Antiqua" w:hAnsi="Book Antiqua"/>
-          <w:highlight w:val="yellow"/>
-          <w:rtl w:val="0"/>
-        </w:rPr>
-        <w:t xml:space="preserve"/>
-      </w:r>
-      <w:r>
-        <w:rPr>
-          <w:rFonts w:ascii="Book Antiqua" w:cs="Book Antiqua" w:eastAsia="Book Antiqua" w:hAnsi="Book Antiqua"/>
-          <w:rtl w:val="0"/>
-        </w:rPr>
-        <w:t xml:space="preserve"/>
-      </w:r>
-      <w:r>
-        <w:rPr>
-          <w:rFonts w:ascii="Book Antiqua" w:cs="Book Antiqua" w:eastAsia="Book Antiqua" w:hAnsi="Book Antiqua"/>
-          <w:highlight w:val="yellow"/>
-          <w:rtl w:val="0"/>
-        </w:rPr>
-        <w:t xml:space="preserve"/>
-      </w:r>
-      <w:r>
-        <w:rPr>
-          <w:rFonts w:ascii="Book Antiqua" w:cs="Book Antiqua" w:eastAsia="Book Antiqua" w:hAnsi="Book Antiqua"/>
-          <w:rtl w:val="0"/>
-        </w:rPr>
-        <w:t xml:space="preserve"/>
-      </w:r>
-      <w:r>
-        <w:rPr>
-          <w:rFonts w:ascii="Book Antiqua" w:cs="Book Antiqua" w:eastAsia="Book Antiqua" w:hAnsi="Book Antiqua"/>
-          <w:highlight w:val="yellow"/>
-          <w:rtl w:val="0"/>
-        </w:rPr>
-        <w:t xml:space="preserve"/>
-      </w:r>
-      <w:r>
-        <w:rPr>
-          <w:rFonts w:ascii="Book Antiqua" w:cs="Book Antiqua" w:eastAsia="Book Antiqua" w:hAnsi="Book Antiqua"/>
-          <w:rtl w:val="0"/>
-        </w:rPr>
-        <w:t xml:space="preserve"/>
-      </w:r>
-      <w:r>
-        <w:rPr>
-          <w:rFonts w:ascii="Book Antiqua" w:cs="Book Antiqua" w:eastAsia="Book Antiqua" w:hAnsi="Book Antiqua"/>
-          <w:highlight w:val="yellow"/>
-          <w:rtl w:val="0"/>
-        </w:rPr>
-        <w:t xml:space="preserve"/>
-      </w:r>
-      <w:r>
-        <w:rPr>
-          <w:rFonts w:ascii="Book Antiqua" w:cs="Book Antiqua" w:eastAsia="Book Antiqua" w:hAnsi="Book Antiqua"/>
-          <w:rtl w:val="0"/>
-        </w:rPr>
-        <w:t xml:space="preserve"/>
-      </w:r>
-      <w:r>
-        <w:rPr>
-          <w:rFonts w:ascii="Book Antiqua" w:cs="Book Antiqua" w:eastAsia="Book Antiqua" w:hAnsi="Book Antiqua"/>
-          <w:highlight w:val="yellow"/>
+        <w:t xml:space="preserve">CONTRATADO: </w:t>
+      </w:r>
+      <w:r>
+        <w:rPr>
+          <w:rFonts w:ascii="Book Antiqua" w:cs="Book Antiqua" w:eastAsia="Book Antiqua" w:hAnsi="Book Antiqua"/>
+          <w:rtl w:val="0"/>
+        </w:rPr>
+        <w:t xml:space="preserve">{razao_social}, pessoa jurídica inscrita no CNPJ nº {cnpj}, com endereço à Rua {endereco} CEP: {cep}, neste ato representado por seu sócio administrador, Sr. {representante}, inscrito no CPF sob o nº {cpf}, telefone {telefone}, endereço eletrônico {email} .</w:t>
+      </w:r>
+      <w:r>
+        <w:rPr>
+          <w:rFonts w:ascii="Book Antiqua" w:cs="Book Antiqua" w:eastAsia="Book Antiqua" w:hAnsi="Book Antiqua"/>
+          <w:rtl w:val="0"/>
+        </w:rPr>
+        <w:t xml:space="preserve"/>
+      </w:r>
+      <w:r>
+        <w:rPr>
+          <w:rFonts w:ascii="Book Antiqua" w:cs="Book Antiqua" w:eastAsia="Book Antiqua" w:hAnsi="Book Antiqua"/>
+          <w:b w:val="1"/>
+          <w:bCs w:val="1"/>
+          <w:rtl w:val="0"/>
+        </w:rPr>
+        <w:t xml:space="preserve"/>
+      </w:r>
+      <w:r>
+        <w:rPr>
+          <w:rFonts w:ascii="Book Antiqua" w:cs="Book Antiqua" w:eastAsia="Book Antiqua" w:hAnsi="Book Antiqua"/>
+          <w:rtl w:val="0"/>
+        </w:rPr>
+        <w:t xml:space="preserve"/>
+      </w:r>
+      <w:r>
+        <w:rPr>
+          <w:rFonts w:ascii="Book Antiqua" w:cs="Book Antiqua" w:eastAsia="Book Antiqua" w:hAnsi="Book Antiqua"/>
+          <w:rtl w:val="0"/>
+        </w:rPr>
+        <w:t xml:space="preserve"/>
+      </w:r>
+      <w:r>
+        <w:rPr>
+          <w:rFonts w:ascii="Book Antiqua" w:cs="Book Antiqua" w:eastAsia="Book Antiqua" w:hAnsi="Book Antiqua"/>
+          <w:rtl w:val="0"/>
+        </w:rPr>
+        <w:t xml:space="preserve"/>
+      </w:r>
+      <w:r>
+        <w:rPr>
+          <w:rFonts w:ascii="Book Antiqua" w:cs="Book Antiqua" w:eastAsia="Book Antiqua" w:hAnsi="Book Antiqua"/>
+          <w:rtl w:val="0"/>
+        </w:rPr>
+        <w:t xml:space="preserve"/>
+      </w:r>
+      <w:r>
+        <w:rPr>
+          <w:rFonts w:ascii="Book Antiqua" w:cs="Book Antiqua" w:eastAsia="Book Antiqua" w:hAnsi="Book Antiqua"/>
+          <w:rtl w:val="0"/>
+        </w:rPr>
+        <w:t xml:space="preserve"/>
+      </w:r>
+      <w:r>
+        <w:rPr>
+          <w:rFonts w:ascii="Book Antiqua" w:cs="Book Antiqua" w:eastAsia="Book Antiqua" w:hAnsi="Book Antiqua"/>
+          <w:rtl w:val="0"/>
+        </w:rPr>
+        <w:t xml:space="preserve"/>
+      </w:r>
+      <w:r>
+        <w:rPr>
+          <w:rFonts w:ascii="Book Antiqua" w:cs="Book Antiqua" w:eastAsia="Book Antiqua" w:hAnsi="Book Antiqua"/>
+          <w:rtl w:val="0"/>
+        </w:rPr>
+        <w:t xml:space="preserve"/>
+      </w:r>
+      <w:r>
+        <w:rPr>
+          <w:rFonts w:ascii="Book Antiqua" w:cs="Book Antiqua" w:eastAsia="Book Antiqua" w:hAnsi="Book Antiqua"/>
+          <w:rtl w:val="0"/>
+        </w:rPr>
+        <w:t xml:space="preserve"/>
+      </w:r>
+      <w:r>
+        <w:rPr>
+          <w:rFonts w:ascii="Book Antiqua" w:cs="Book Antiqua" w:eastAsia="Book Antiqua" w:hAnsi="Book Antiqua"/>
+          <w:rtl w:val="0"/>
+        </w:rPr>
+        <w:t xml:space="preserve"/>
+      </w:r>
+      <w:r>
+        <w:rPr>
+          <w:rFonts w:ascii="Book Antiqua" w:cs="Book Antiqua" w:eastAsia="Book Antiqua" w:hAnsi="Book Antiqua"/>
           <w:rtl w:val="0"/>
         </w:rPr>
         <w:t xml:space="preserve"/>
@@ -215,7 +216,6 @@
         <w:rPr>
           <w:rFonts w:ascii="Book Antiqua" w:cs="Book Antiqua" w:eastAsia="Book Antiqua" w:hAnsi="Book Antiqua"/>
           <w:color w:val="ff0000"/>
-          <w:highlight w:val="yellow"/>
           <w:rtl w:val="0"/>
         </w:rPr>
         <w:t xml:space="preserve"/>
@@ -231,7 +231,6 @@
         <w:r>
           <w:rPr>
             <w:rFonts w:ascii="Book Antiqua" w:cs="Book Antiqua" w:eastAsia="Book Antiqua" w:hAnsi="Book Antiqua"/>
-            <w:highlight w:val="yellow"/>
             <w:u w:val="single"/>
             <w:rtl w:val="0"/>
           </w:rPr>
@@ -267,7 +266,7 @@
           <w:rFonts w:ascii="Book Antiqua" w:cs="Book Antiqua" w:eastAsia="Book Antiqua" w:hAnsi="Book Antiqua"/>
           <w:rtl w:val="0"/>
         </w:rPr>
-        <w:t xml:space="preserve">resolvem as partes celebrar o presente Contrato de prestação de serviços de Líder Técnico, que será regido pelas seguintes cláusulas e condições:</w:t>
+        <w:t xml:space="preserve">resolvem as partes celebrar o presente Contrato de prestação de serviços de {nome_cargo}, que será regido pelas seguintes cláusulas e condições:</w:t>
       </w:r>
     </w:p>
     <w:p>
@@ -310,7 +309,6 @@
       <w:r>
         <w:rPr>
           <w:rFonts w:ascii="Book Antiqua" w:cs="Book Antiqua" w:eastAsia="Book Antiqua" w:hAnsi="Book Antiqua"/>
-          <w:highlight w:val="yellow"/>
           <w:rtl w:val="0"/>
         </w:rPr>
         <w:t xml:space="preserve">Gestor de Tráfego Pago</w:t>
@@ -800,7 +798,6 @@
       <w:r>
         <w:rPr>
           <w:rFonts w:ascii="Book Antiqua" w:cs="Book Antiqua" w:eastAsia="Book Antiqua" w:hAnsi="Book Antiqua"/>
-          <w:highlight w:val="yellow"/>
           <w:rtl w:val="0"/>
         </w:rPr>
         <w:t xml:space="preserve"/>
@@ -920,7 +917,6 @@
       <w:r>
         <w:rPr>
           <w:rFonts w:ascii="Book Antiqua" w:cs="Book Antiqua" w:eastAsia="Book Antiqua" w:hAnsi="Book Antiqua"/>
-          <w:highlight w:val="yellow"/>
           <w:rtl w:val="0"/>
         </w:rPr>
         <w:t xml:space="preserve"/>
@@ -952,15 +948,13 @@
         <w:rPr>
           <w:rFonts w:ascii="Book Antiqua" w:cs="Book Antiqua" w:eastAsia="Book Antiqua" w:hAnsi="Book Antiqua"/>
           <w:color w:val="ff0000"/>
-          <w:highlight w:val="yellow"/>
-          <w:rtl w:val="0"/>
-        </w:rPr>
-        <w:t xml:space="preserve"/>
-      </w:r>
-      <w:r>
-        <w:rPr>
-          <w:rFonts w:ascii="Book Antiqua" w:cs="Book Antiqua" w:eastAsia="Book Antiqua" w:hAnsi="Book Antiqua"/>
-          <w:highlight w:val="yellow"/>
+          <w:rtl w:val="0"/>
+        </w:rPr>
+        <w:t xml:space="preserve"/>
+      </w:r>
+      <w:r>
+        <w:rPr>
+          <w:rFonts w:ascii="Book Antiqua" w:cs="Book Antiqua" w:eastAsia="Book Antiqua" w:hAnsi="Book Antiqua"/>
           <w:rtl w:val="0"/>
         </w:rPr>
         <w:t xml:space="preserve"/>
@@ -969,7 +963,6 @@
         <w:rPr>
           <w:rFonts w:ascii="Book Antiqua" w:cs="Book Antiqua" w:eastAsia="Book Antiqua" w:hAnsi="Book Antiqua"/>
           <w:color w:val="ff0000"/>
-          <w:highlight w:val="yellow"/>
           <w:rtl w:val="0"/>
         </w:rPr>
         <w:t xml:space="preserve"/>
@@ -1003,7 +996,7 @@
           <w:rFonts w:ascii="Book Antiqua" w:cs="Book Antiqua" w:eastAsia="Book Antiqua" w:hAnsi="Book Antiqua"/>
           <w:rtl w:val="0"/>
         </w:rPr>
-        <w:t xml:space="preserve">§1°- Os valores serão pagos via PIX, transferência ou depósito bancário.</w:t>
+        <w:t xml:space="preserve">§1°- Os valores serão pagos via PIX, transferência ou depósito bancário, por meio da chave vinculada ao {chave_pix}.</w:t>
       </w:r>
     </w:p>
     <w:p>
@@ -1840,7 +1833,6 @@
           <w:b w:val="1"/>
           <w:bCs w:val="1"/>
           <w:color w:val="ff0000"/>
-          <w:highlight w:val="yellow"/>
         </w:rPr>
         <w:sectPr>
           <w:type w:val="continuous"/>
@@ -1857,10 +1849,9 @@
           <w:rFonts w:ascii="Book Antiqua" w:cs="Book Antiqua" w:eastAsia="Book Antiqua" w:hAnsi="Book Antiqua"/>
           <w:b w:val="1"/>
           <w:bCs w:val="1"/>
-          <w:highlight w:val="yellow"/>
-          <w:rtl w:val="0"/>
-        </w:rPr>
-        <w:t xml:space="preserve">CONTRATADA </w:t>
+          <w:rtl w:val="0"/>
+        </w:rPr>
+        <w:t xml:space="preserve">{representante}</w:t>
       </w:r>
       <w:r>
         <w:rPr>

</xml_diff>